<commit_message>
Update report and screenshots to match the simplified raw-UI code
</commit_message>
<xml_diff>
--- a/report/IS-Assignment-Report.docx
+++ b/report/IS-Assignment-Report.docx
@@ -116,7 +116,7 @@
         <w:rPr>
           <w:sz w:val="24"/>
         </w:rPr>
-        <w:t>Name: ______________________________</w:t>
+        <w:t>Name: Hadi Wasim</w:t>
       </w:r>
     </w:p>
     <w:p>
@@ -158,7 +158,7 @@
         <w:rPr>
           <w:sz w:val="24"/>
         </w:rPr>
-        <w:t>Date: 7 October 2026</w:t>
+        <w:t>Date: 10 October 2026</w:t>
       </w:r>
     </w:p>
     <w:p>
@@ -226,7 +226,7 @@
         <w:rPr>
           <w:noProof/>
         </w:rPr>
-        <w:instrText xml:space="preserve"> PAGEREF _Toc242295511 \h </w:instrText>
+        <w:instrText xml:space="preserve"> PAGEREF _Toc242551116 \h </w:instrText>
       </w:r>
       <w:r>
         <w:rPr>
@@ -284,7 +284,7 @@
         <w:rPr>
           <w:noProof/>
         </w:rPr>
-        <w:instrText xml:space="preserve"> PAGEREF _Toc242295512 \h </w:instrText>
+        <w:instrText xml:space="preserve"> PAGEREF _Toc242551117 \h </w:instrText>
       </w:r>
       <w:r>
         <w:rPr>
@@ -342,7 +342,7 @@
         <w:rPr>
           <w:noProof/>
         </w:rPr>
-        <w:instrText xml:space="preserve"> PAGEREF _Toc242295513 \h </w:instrText>
+        <w:instrText xml:space="preserve"> PAGEREF _Toc242551118 \h </w:instrText>
       </w:r>
       <w:r>
         <w:rPr>
@@ -400,7 +400,7 @@
         <w:rPr>
           <w:noProof/>
         </w:rPr>
-        <w:instrText xml:space="preserve"> PAGEREF _Toc242295514 \h </w:instrText>
+        <w:instrText xml:space="preserve"> PAGEREF _Toc242551119 \h </w:instrText>
       </w:r>
       <w:r>
         <w:rPr>
@@ -458,7 +458,7 @@
         <w:rPr>
           <w:noProof/>
         </w:rPr>
-        <w:instrText xml:space="preserve"> PAGEREF _Toc242295515 \h </w:instrText>
+        <w:instrText xml:space="preserve"> PAGEREF _Toc242551120 \h </w:instrText>
       </w:r>
       <w:r>
         <w:rPr>
@@ -516,7 +516,7 @@
         <w:rPr>
           <w:noProof/>
         </w:rPr>
-        <w:instrText xml:space="preserve"> PAGEREF _Toc242295516 \h </w:instrText>
+        <w:instrText xml:space="preserve"> PAGEREF _Toc242551121 \h </w:instrText>
       </w:r>
       <w:r>
         <w:rPr>
@@ -574,7 +574,7 @@
         <w:rPr>
           <w:noProof/>
         </w:rPr>
-        <w:instrText xml:space="preserve"> PAGEREF _Toc242295517 \h </w:instrText>
+        <w:instrText xml:space="preserve"> PAGEREF _Toc242551122 \h </w:instrText>
       </w:r>
       <w:r>
         <w:rPr>
@@ -632,7 +632,7 @@
         <w:rPr>
           <w:noProof/>
         </w:rPr>
-        <w:instrText xml:space="preserve"> PAGEREF _Toc242295518 \h </w:instrText>
+        <w:instrText xml:space="preserve"> PAGEREF _Toc242551123 \h </w:instrText>
       </w:r>
       <w:r>
         <w:rPr>
@@ -690,7 +690,7 @@
         <w:rPr>
           <w:noProof/>
         </w:rPr>
-        <w:instrText xml:space="preserve"> PAGEREF _Toc242295519 \h </w:instrText>
+        <w:instrText xml:space="preserve"> PAGEREF _Toc242551124 \h </w:instrText>
       </w:r>
       <w:r>
         <w:rPr>
@@ -748,7 +748,7 @@
         <w:rPr>
           <w:noProof/>
         </w:rPr>
-        <w:instrText xml:space="preserve"> PAGEREF _Toc242295520 \h </w:instrText>
+        <w:instrText xml:space="preserve"> PAGEREF _Toc242551125 \h </w:instrText>
       </w:r>
       <w:r>
         <w:rPr>
@@ -806,7 +806,7 @@
         <w:rPr>
           <w:noProof/>
         </w:rPr>
-        <w:instrText xml:space="preserve"> PAGEREF _Toc242295521 \h </w:instrText>
+        <w:instrText xml:space="preserve"> PAGEREF _Toc242551126 \h </w:instrText>
       </w:r>
       <w:r>
         <w:rPr>
@@ -864,7 +864,7 @@
         <w:rPr>
           <w:noProof/>
         </w:rPr>
-        <w:instrText xml:space="preserve"> PAGEREF _Toc242295522 \h </w:instrText>
+        <w:instrText xml:space="preserve"> PAGEREF _Toc242551127 \h </w:instrText>
       </w:r>
       <w:r>
         <w:rPr>
@@ -922,7 +922,7 @@
         <w:rPr>
           <w:noProof/>
         </w:rPr>
-        <w:instrText xml:space="preserve"> PAGEREF _Toc242295523 \h </w:instrText>
+        <w:instrText xml:space="preserve"> PAGEREF _Toc242551128 \h </w:instrText>
       </w:r>
       <w:r>
         <w:rPr>
@@ -980,7 +980,7 @@
         <w:rPr>
           <w:noProof/>
         </w:rPr>
-        <w:instrText xml:space="preserve"> PAGEREF _Toc242295524 \h </w:instrText>
+        <w:instrText xml:space="preserve"> PAGEREF _Toc242551129 \h </w:instrText>
       </w:r>
       <w:r>
         <w:rPr>
@@ -1038,7 +1038,7 @@
         <w:rPr>
           <w:noProof/>
         </w:rPr>
-        <w:instrText xml:space="preserve"> PAGEREF _Toc242295525 \h </w:instrText>
+        <w:instrText xml:space="preserve"> PAGEREF _Toc242551130 \h </w:instrText>
       </w:r>
       <w:r>
         <w:rPr>
@@ -1096,7 +1096,7 @@
         <w:rPr>
           <w:noProof/>
         </w:rPr>
-        <w:instrText xml:space="preserve"> PAGEREF _Toc242295526 \h </w:instrText>
+        <w:instrText xml:space="preserve"> PAGEREF _Toc242551131 \h </w:instrText>
       </w:r>
       <w:r>
         <w:rPr>
@@ -1154,7 +1154,7 @@
         <w:rPr>
           <w:noProof/>
         </w:rPr>
-        <w:instrText xml:space="preserve"> PAGEREF _Toc242295527 \h </w:instrText>
+        <w:instrText xml:space="preserve"> PAGEREF _Toc242551132 \h </w:instrText>
       </w:r>
       <w:r>
         <w:rPr>
@@ -1212,7 +1212,7 @@
         <w:rPr>
           <w:noProof/>
         </w:rPr>
-        <w:instrText xml:space="preserve"> PAGEREF _Toc242295528 \h </w:instrText>
+        <w:instrText xml:space="preserve"> PAGEREF _Toc242551133 \h </w:instrText>
       </w:r>
       <w:r>
         <w:rPr>
@@ -1270,7 +1270,7 @@
         <w:rPr>
           <w:noProof/>
         </w:rPr>
-        <w:instrText xml:space="preserve"> PAGEREF _Toc242295529 \h </w:instrText>
+        <w:instrText xml:space="preserve"> PAGEREF _Toc242551134 \h </w:instrText>
       </w:r>
       <w:r>
         <w:rPr>
@@ -1328,7 +1328,7 @@
         <w:rPr>
           <w:noProof/>
         </w:rPr>
-        <w:instrText xml:space="preserve"> PAGEREF _Toc242295530 \h </w:instrText>
+        <w:instrText xml:space="preserve"> PAGEREF _Toc242551135 \h </w:instrText>
       </w:r>
       <w:r>
         <w:rPr>
@@ -1386,7 +1386,7 @@
         <w:rPr>
           <w:noProof/>
         </w:rPr>
-        <w:instrText xml:space="preserve"> PAGEREF _Toc242295531 \h </w:instrText>
+        <w:instrText xml:space="preserve"> PAGEREF _Toc242551136 \h </w:instrText>
       </w:r>
       <w:r>
         <w:rPr>
@@ -1444,7 +1444,7 @@
         <w:rPr>
           <w:noProof/>
         </w:rPr>
-        <w:instrText xml:space="preserve"> PAGEREF _Toc242295532 \h </w:instrText>
+        <w:instrText xml:space="preserve"> PAGEREF _Toc242551137 \h </w:instrText>
       </w:r>
       <w:r>
         <w:rPr>
@@ -1502,7 +1502,7 @@
         <w:rPr>
           <w:noProof/>
         </w:rPr>
-        <w:instrText xml:space="preserve"> PAGEREF _Toc242295533 \h </w:instrText>
+        <w:instrText xml:space="preserve"> PAGEREF _Toc242551138 \h </w:instrText>
       </w:r>
       <w:r>
         <w:rPr>
@@ -1560,7 +1560,7 @@
         <w:rPr>
           <w:noProof/>
         </w:rPr>
-        <w:instrText xml:space="preserve"> PAGEREF _Toc242295534 \h </w:instrText>
+        <w:instrText xml:space="preserve"> PAGEREF _Toc242551139 \h </w:instrText>
       </w:r>
       <w:r>
         <w:rPr>
@@ -1618,7 +1618,7 @@
         <w:rPr>
           <w:noProof/>
         </w:rPr>
-        <w:instrText xml:space="preserve"> PAGEREF _Toc242295535 \h </w:instrText>
+        <w:instrText xml:space="preserve"> PAGEREF _Toc242551140 \h </w:instrText>
       </w:r>
       <w:r>
         <w:rPr>
@@ -1676,7 +1676,7 @@
         <w:rPr>
           <w:noProof/>
         </w:rPr>
-        <w:instrText xml:space="preserve"> PAGEREF _Toc242295536 \h </w:instrText>
+        <w:instrText xml:space="preserve"> PAGEREF _Toc242551141 \h </w:instrText>
       </w:r>
       <w:r>
         <w:rPr>
@@ -1719,7 +1719,7 @@
       <w:pPr>
         <w:pStyle w:val="Heading1"/>
       </w:pPr>
-      <w:bookmarkStart w:id="0" w:name="_Toc242295511"/>
+      <w:bookmarkStart w:id="0" w:name="_Toc242551116"/>
       <w:r>
         <w:lastRenderedPageBreak/>
         <w:t>Part 1 - Stack-Based Buffer Overflow</w:t>
@@ -1730,7 +1730,7 @@
       <w:pPr>
         <w:pStyle w:val="Heading2"/>
       </w:pPr>
-      <w:bookmarkStart w:id="1" w:name="_Toc242295512"/>
+      <w:bookmarkStart w:id="1" w:name="_Toc242551117"/>
       <w:r>
         <w:t>1.1  Objective</w:t>
       </w:r>
@@ -1745,7 +1745,7 @@
       <w:pPr>
         <w:pStyle w:val="Heading2"/>
       </w:pPr>
-      <w:bookmarkStart w:id="2" w:name="_Toc242295513"/>
+      <w:bookmarkStart w:id="2" w:name="_Toc242551118"/>
       <w:r>
         <w:t>1.2  Why the program is vulnerable</w:t>
       </w:r>
@@ -1785,7 +1785,7 @@
           <w:sz w:val="18"/>
         </w:rPr>
         <w:br/>
-        <w:t xml:space="preserve">    strcpy(buffer, str);   // BUG: no bounds check</w:t>
+        <w:t xml:space="preserve">    strcpy(buffer, str);</w:t>
       </w:r>
       <w:r>
         <w:rPr>
@@ -1824,7 +1824,7 @@
           <w:sz w:val="18"/>
         </w:rPr>
         <w:br/>
-        <w:t xml:space="preserve">    char str[517];</w:t>
+        <w:t xml:space="preserve">    char input[517];</w:t>
       </w:r>
       <w:r>
         <w:rPr>
@@ -1832,7 +1832,7 @@
           <w:sz w:val="18"/>
         </w:rPr>
         <w:br/>
-        <w:t xml:space="preserve">    FILE *badfile = fopen("badfile", "r");</w:t>
+        <w:t xml:space="preserve">    FILE *badFile = fopen("badfile", "r");</w:t>
       </w:r>
       <w:r>
         <w:rPr>
@@ -1840,7 +1840,7 @@
           <w:sz w:val="18"/>
         </w:rPr>
         <w:br/>
-        <w:t xml:space="preserve">    fread(str, sizeof(char), 517, badfile);   // up to 517 attacker bytes</w:t>
+        <w:t xml:space="preserve">    fread(input, sizeof(char), 517, badFile);</w:t>
       </w:r>
       <w:r>
         <w:rPr>
@@ -1848,7 +1848,7 @@
           <w:sz w:val="18"/>
         </w:rPr>
         <w:br/>
-        <w:t xml:space="preserve">    bof(str);</w:t>
+        <w:t xml:space="preserve">    fclose(badFile);</w:t>
       </w:r>
       <w:r>
         <w:rPr>
@@ -1856,7 +1856,23 @@
           <w:sz w:val="18"/>
         </w:rPr>
         <w:br/>
-        <w:t xml:space="preserve">    printf("Returned Properly\n");            // never prints if hijacked</w:t>
+        <w:t xml:space="preserve">    bof(input);</w:t>
+      </w:r>
+      <w:r>
+        <w:rPr>
+          <w:rFonts w:ascii="Consolas" w:hAnsi="Consolas"/>
+          <w:sz w:val="18"/>
+        </w:rPr>
+        <w:br/>
+        <w:t xml:space="preserve">    printf("Returned Properly\n");</w:t>
+      </w:r>
+      <w:r>
+        <w:rPr>
+          <w:rFonts w:ascii="Consolas" w:hAnsi="Consolas"/>
+          <w:sz w:val="18"/>
+        </w:rPr>
+        <w:br/>
+        <w:t xml:space="preserve">    return 1;</w:t>
       </w:r>
       <w:r>
         <w:rPr>
@@ -1876,7 +1892,7 @@
       <w:pPr>
         <w:pStyle w:val="Heading2"/>
       </w:pPr>
-      <w:bookmarkStart w:id="3" w:name="_Toc242295514"/>
+      <w:bookmarkStart w:id="3" w:name="_Toc242551119"/>
       <w:r>
         <w:t>1.3  Stack layout and payload design</w:t>
       </w:r>
@@ -1985,7 +2001,7 @@
           <w:rFonts w:ascii="Consolas" w:hAnsi="Consolas"/>
           <w:sz w:val="18"/>
         </w:rPr>
-        <w:t>memset(buffer, 0x90, 517);                 // (1) NOP sled over the whole payload</w:t>
+        <w:t>memset(buffer, 0x90, 517);</w:t>
       </w:r>
       <w:r>
         <w:rPr>
@@ -1993,7 +2009,7 @@
           <w:sz w:val="18"/>
         </w:rPr>
         <w:br/>
-        <w:t>int start = 517 - sizeof(shellcode) - 10;  // (2) shellcode near the end (offset 480)</w:t>
+        <w:t>int scLen = sizeof(shellCode) - 1;</w:t>
       </w:r>
       <w:r>
         <w:rPr>
@@ -2001,7 +2017,7 @@
           <w:sz w:val="18"/>
         </w:rPr>
         <w:br/>
-        <w:t>memcpy(buffer + start, shellcode, sizeof(shellcode) - 1);</w:t>
+        <w:t>int start = 517 - scLen - 10;</w:t>
       </w:r>
       <w:r>
         <w:rPr>
@@ -2009,11 +2025,28 @@
           <w:sz w:val="18"/>
         </w:rPr>
         <w:br/>
-        <w:t>*(unsigned long *)(buffer + 20) = 0x7fffffffe594;  // (3) overwrite return address</w:t>
-      </w:r>
-    </w:p>
-    <w:p>
-      <w:r>
+        <w:t>memcpy(buffer + start, shellCode, scLen);</w:t>
+      </w:r>
+      <w:r>
+        <w:rPr>
+          <w:rFonts w:ascii="Consolas" w:hAnsi="Consolas"/>
+          <w:sz w:val="18"/>
+        </w:rPr>
+        <w:br/>
+        <w:t>unsigned long ret = 0x7fffffffe594;</w:t>
+      </w:r>
+      <w:r>
+        <w:rPr>
+          <w:rFonts w:ascii="Consolas" w:hAnsi="Consolas"/>
+          <w:sz w:val="18"/>
+        </w:rPr>
+        <w:br/>
+        <w:t>*(unsigned long *)(buffer + 20) = ret;</w:t>
+      </w:r>
+    </w:p>
+    <w:p>
+      <w:r>
+        <w:lastRenderedPageBreak/>
         <w:t>The shellcode is the standard SEED-Labs x86-64 execve("/bin/sh") stub; the learning objective of this task is the stack-layout and offset reasoning, so the shellcode is treated as an opaque, provided payload.</w:t>
       </w:r>
     </w:p>
@@ -2021,9 +2054,8 @@
       <w:pPr>
         <w:pStyle w:val="Heading2"/>
       </w:pPr>
-      <w:bookmarkStart w:id="4" w:name="_Toc242295515"/>
-      <w:r>
-        <w:lastRenderedPageBreak/>
+      <w:bookmarkStart w:id="4" w:name="_Toc242551120"/>
+      <w:r>
         <w:t>1.4  Disabling protections (lab only)</w:t>
       </w:r>
       <w:bookmarkEnd w:id="4"/>
@@ -2090,7 +2122,7 @@
       <w:pPr>
         <w:pStyle w:val="Heading2"/>
       </w:pPr>
-      <w:bookmarkStart w:id="5" w:name="_Toc242295516"/>
+      <w:bookmarkStart w:id="5" w:name="_Toc242551121"/>
       <w:r>
         <w:t>1.5  Execution and proof</w:t>
       </w:r>
@@ -2110,10 +2142,10 @@
           <w:noProof/>
         </w:rPr>
         <w:drawing>
-          <wp:inline distT="0" distB="0" distL="0" distR="0" wp14:anchorId="0FAA42FF" wp14:editId="36FCDC6F">
+          <wp:inline distT="0" distB="0" distL="0" distR="0" wp14:anchorId="20521999" wp14:editId="52748101">
             <wp:extent cx="5715000" cy="3571717"/>
             <wp:effectExtent l="19050" t="19050" r="19050" b="10160"/>
-            <wp:docPr id="1234777536" name="Picture 1"/>
+            <wp:docPr id="142820370" name="Picture 1"/>
             <wp:cNvGraphicFramePr>
               <a:graphicFrameLocks xmlns:a="http://schemas.openxmlformats.org/drawingml/2006/main" noChangeAspect="1"/>
             </wp:cNvGraphicFramePr>
@@ -2121,7 +2153,7 @@
               <a:graphicData uri="http://schemas.openxmlformats.org/drawingml/2006/picture">
                 <pic:pic xmlns:pic="http://schemas.openxmlformats.org/drawingml/2006/picture">
                   <pic:nvPicPr>
-                    <pic:cNvPr id="1234777536" name=""/>
+                    <pic:cNvPr id="142820370" name=""/>
                     <pic:cNvPicPr/>
                   </pic:nvPicPr>
                   <pic:blipFill>
@@ -2178,7 +2210,7 @@
       <w:pPr>
         <w:pStyle w:val="Heading2"/>
       </w:pPr>
-      <w:bookmarkStart w:id="6" w:name="_Toc242295517"/>
+      <w:bookmarkStart w:id="6" w:name="_Toc242551122"/>
       <w:r>
         <w:t>1.6  Defences</w:t>
       </w:r>
@@ -2194,6 +2226,7 @@
         <w:pStyle w:val="ListBullet"/>
       </w:pPr>
       <w:r>
+        <w:lastRenderedPageBreak/>
         <w:t>Stack canaries - a random guard value placed before the return address; strcpy overflow corrupts it and the program aborts before returning.</w:t>
       </w:r>
     </w:p>
@@ -2210,7 +2243,6 @@
         <w:pStyle w:val="ListBullet"/>
       </w:pPr>
       <w:r>
-        <w:lastRenderedPageBreak/>
         <w:t>ASLR and PIE - randomise stack and code addresses each run, so a hard-coded return address no longer points at the sled.</w:t>
       </w:r>
     </w:p>
@@ -2226,7 +2258,7 @@
       <w:pPr>
         <w:pStyle w:val="Heading2"/>
       </w:pPr>
-      <w:bookmarkStart w:id="7" w:name="_Toc242295518"/>
+      <w:bookmarkStart w:id="7" w:name="_Toc242551123"/>
       <w:r>
         <w:t>1.7  Note on the brief</w:t>
       </w:r>
@@ -2265,7 +2297,7 @@
       <w:pPr>
         <w:pStyle w:val="Heading1"/>
       </w:pPr>
-      <w:bookmarkStart w:id="8" w:name="_Toc242295519"/>
+      <w:bookmarkStart w:id="8" w:name="_Toc242551124"/>
       <w:r>
         <w:lastRenderedPageBreak/>
         <w:t>Part 2 - Web Application Security (NovaBank)</w:t>
@@ -2276,7 +2308,7 @@
       <w:pPr>
         <w:pStyle w:val="Heading2"/>
       </w:pPr>
-      <w:bookmarkStart w:id="9" w:name="_Toc242295520"/>
+      <w:bookmarkStart w:id="9" w:name="_Toc242551125"/>
       <w:r>
         <w:t>2.1  Overview</w:t>
       </w:r>
@@ -2305,7 +2337,7 @@
     </w:p>
     <w:p>
       <w:r>
-        <w:t>A coloured banner makes the active mode obvious: red for vulnerable, green for safe. Every security-relevant branch in the code is marked [VULNERABLE] or [SAFE] so the two versions can be compared side by side. The application demonstrates reflected, stored and DOM-based XSS; CSRF; and SQL injection at easy, intermediate and advanced levels - each shown succeeding in vulnerable mode and blocked in safe mode.</w:t>
+        <w:t>A line at the top of every page shows the active mode (mode: vulnerable or mode: safe). The intentionally plain, unstyled pages keep the focus on the security behaviour rather than presentation. In the code a single flag (config.isSafe) switches each feature between its vulnerable and fixed path. The application demonstrates reflected, stored and DOM-based XSS; CSRF; and SQL injection at easy, intermediate and advanced levels - each shown succeeding in vulnerable mode and blocked in safe mode.</w:t>
       </w:r>
     </w:p>
     <w:p>
@@ -2317,10 +2349,10 @@
           <w:noProof/>
         </w:rPr>
         <w:drawing>
-          <wp:inline distT="0" distB="0" distL="0" distR="0" wp14:anchorId="374C4693" wp14:editId="4A4793C5">
+          <wp:inline distT="0" distB="0" distL="0" distR="0" wp14:anchorId="38132BAD" wp14:editId="17CDEFC8">
             <wp:extent cx="5715000" cy="3571717"/>
             <wp:effectExtent l="19050" t="19050" r="19050" b="10160"/>
-            <wp:docPr id="1756764455" name="Picture 2"/>
+            <wp:docPr id="1308504125" name="Picture 2"/>
             <wp:cNvGraphicFramePr>
               <a:graphicFrameLocks xmlns:a="http://schemas.openxmlformats.org/drawingml/2006/main" noChangeAspect="1"/>
             </wp:cNvGraphicFramePr>
@@ -2328,7 +2360,7 @@
               <a:graphicData uri="http://schemas.openxmlformats.org/drawingml/2006/picture">
                 <pic:pic xmlns:pic="http://schemas.openxmlformats.org/drawingml/2006/picture">
                   <pic:nvPicPr>
-                    <pic:cNvPr id="1756764455" name=""/>
+                    <pic:cNvPr id="1308504125" name=""/>
                     <pic:cNvPicPr/>
                   </pic:nvPicPr>
                   <pic:blipFill>
@@ -2373,7 +2405,7 @@
           <w:i/>
           <w:sz w:val="18"/>
         </w:rPr>
-        <w:t>Figure 2.1 - NovaBank login page in vulnerable mode (red banner). The same page in safe mode shows a green "defenses ON" banner.</w:t>
+        <w:t>Figure 2.1 - NovaBank login page in vulnerable mode (the top line reads "mode: vulnerable"). In safe mode the same line reads "mode: safe".</w:t>
       </w:r>
     </w:p>
     <w:p>
@@ -2385,7 +2417,7 @@
       <w:pPr>
         <w:pStyle w:val="Heading2"/>
       </w:pPr>
-      <w:bookmarkStart w:id="10" w:name="_Toc242295521"/>
+      <w:bookmarkStart w:id="10" w:name="_Toc242551126"/>
       <w:r>
         <w:t>2.2  Cross-Site Scripting - Reflected</w:t>
       </w:r>
@@ -2398,12 +2430,12 @@
     </w:p>
     <w:p>
       <w:r>
-        <w:t>Payload:   &lt;img src=x onerror=alert('Reflected-XSS')&gt;</w:t>
-      </w:r>
-    </w:p>
-    <w:p>
-      <w:r>
-        <w:t>Because the broken image fails to load, its onerror handler runs the attacker's JavaScript:</w:t>
+        <w:t>Payload:   &lt;script&gt;alert('Reflected-XSS')&lt;/script&gt;</w:t>
+      </w:r>
+    </w:p>
+    <w:p>
+      <w:r>
+        <w:t>In vulnerable mode the term is written straight into the page HTML, so the injected script tag executes as the page renders:</w:t>
       </w:r>
     </w:p>
     <w:p>
@@ -2416,10 +2448,10 @@
         </w:rPr>
         <w:lastRenderedPageBreak/>
         <w:drawing>
-          <wp:inline distT="0" distB="0" distL="0" distR="0" wp14:anchorId="423F3F87" wp14:editId="54EAAEFA">
+          <wp:inline distT="0" distB="0" distL="0" distR="0" wp14:anchorId="7B79DCE4" wp14:editId="149E4BC8">
             <wp:extent cx="5715000" cy="3571717"/>
             <wp:effectExtent l="19050" t="19050" r="19050" b="10160"/>
-            <wp:docPr id="383769286" name="Picture 3"/>
+            <wp:docPr id="1971424608" name="Picture 3"/>
             <wp:cNvGraphicFramePr>
               <a:graphicFrameLocks xmlns:a="http://schemas.openxmlformats.org/drawingml/2006/main" noChangeAspect="1"/>
             </wp:cNvGraphicFramePr>
@@ -2427,7 +2459,7 @@
               <a:graphicData uri="http://schemas.openxmlformats.org/drawingml/2006/picture">
                 <pic:pic xmlns:pic="http://schemas.openxmlformats.org/drawingml/2006/picture">
                   <pic:nvPicPr>
-                    <pic:cNvPr id="383769286" name=""/>
+                    <pic:cNvPr id="1971424608" name=""/>
                     <pic:cNvPicPr/>
                   </pic:nvPicPr>
                   <pic:blipFill>
@@ -2489,10 +2521,10 @@
           <w:noProof/>
         </w:rPr>
         <w:drawing>
-          <wp:inline distT="0" distB="0" distL="0" distR="0" wp14:anchorId="6CBBD064" wp14:editId="11967A9E">
+          <wp:inline distT="0" distB="0" distL="0" distR="0" wp14:anchorId="6478C7A3" wp14:editId="58822A51">
             <wp:extent cx="5715000" cy="3571717"/>
             <wp:effectExtent l="19050" t="19050" r="19050" b="10160"/>
-            <wp:docPr id="1023717219" name="Picture 4"/>
+            <wp:docPr id="1800482885" name="Picture 4"/>
             <wp:cNvGraphicFramePr>
               <a:graphicFrameLocks xmlns:a="http://schemas.openxmlformats.org/drawingml/2006/main" noChangeAspect="1"/>
             </wp:cNvGraphicFramePr>
@@ -2500,7 +2532,7 @@
               <a:graphicData uri="http://schemas.openxmlformats.org/drawingml/2006/picture">
                 <pic:pic xmlns:pic="http://schemas.openxmlformats.org/drawingml/2006/picture">
                   <pic:nvPicPr>
-                    <pic:cNvPr id="1023717219" name=""/>
+                    <pic:cNvPr id="1800482885" name=""/>
                     <pic:cNvPicPr/>
                   </pic:nvPicPr>
                   <pic:blipFill>
@@ -2552,7 +2584,7 @@
       <w:pPr>
         <w:pStyle w:val="Heading2"/>
       </w:pPr>
-      <w:bookmarkStart w:id="11" w:name="_Toc242295522"/>
+      <w:bookmarkStart w:id="11" w:name="_Toc242551127"/>
       <w:r>
         <w:lastRenderedPageBreak/>
         <w:t>2.3  Cross-Site Scripting - Stored</w:t>
@@ -2578,10 +2610,10 @@
           <w:noProof/>
         </w:rPr>
         <w:drawing>
-          <wp:inline distT="0" distB="0" distL="0" distR="0" wp14:anchorId="04F299A6" wp14:editId="15DE70B5">
+          <wp:inline distT="0" distB="0" distL="0" distR="0" wp14:anchorId="69E159EB" wp14:editId="4A311868">
             <wp:extent cx="5715000" cy="3571717"/>
             <wp:effectExtent l="19050" t="19050" r="19050" b="10160"/>
-            <wp:docPr id="1946684166" name="Picture 5"/>
+            <wp:docPr id="834862711" name="Picture 5"/>
             <wp:cNvGraphicFramePr>
               <a:graphicFrameLocks xmlns:a="http://schemas.openxmlformats.org/drawingml/2006/main" noChangeAspect="1"/>
             </wp:cNvGraphicFramePr>
@@ -2589,7 +2621,7 @@
               <a:graphicData uri="http://schemas.openxmlformats.org/drawingml/2006/picture">
                 <pic:pic xmlns:pic="http://schemas.openxmlformats.org/drawingml/2006/picture">
                   <pic:nvPicPr>
-                    <pic:cNvPr id="1946684166" name=""/>
+                    <pic:cNvPr id="834862711" name=""/>
                     <pic:cNvPicPr/>
                   </pic:nvPicPr>
                   <pic:blipFill>
@@ -2652,10 +2684,10 @@
         </w:rPr>
         <w:lastRenderedPageBreak/>
         <w:drawing>
-          <wp:inline distT="0" distB="0" distL="0" distR="0" wp14:anchorId="330B22C6" wp14:editId="661384E7">
+          <wp:inline distT="0" distB="0" distL="0" distR="0" wp14:anchorId="3884E608" wp14:editId="52E58521">
             <wp:extent cx="5715000" cy="3571717"/>
             <wp:effectExtent l="19050" t="19050" r="19050" b="10160"/>
-            <wp:docPr id="257561593" name="Picture 6"/>
+            <wp:docPr id="505697211" name="Picture 6"/>
             <wp:cNvGraphicFramePr>
               <a:graphicFrameLocks xmlns:a="http://schemas.openxmlformats.org/drawingml/2006/main" noChangeAspect="1"/>
             </wp:cNvGraphicFramePr>
@@ -2663,7 +2695,7 @@
               <a:graphicData uri="http://schemas.openxmlformats.org/drawingml/2006/picture">
                 <pic:pic xmlns:pic="http://schemas.openxmlformats.org/drawingml/2006/picture">
                   <pic:nvPicPr>
-                    <pic:cNvPr id="257561593" name=""/>
+                    <pic:cNvPr id="505697211" name=""/>
                     <pic:cNvPicPr/>
                   </pic:nvPicPr>
                   <pic:blipFill>
@@ -2715,7 +2747,7 @@
       <w:pPr>
         <w:pStyle w:val="Heading2"/>
       </w:pPr>
-      <w:bookmarkStart w:id="12" w:name="_Toc242295523"/>
+      <w:bookmarkStart w:id="12" w:name="_Toc242551128"/>
       <w:r>
         <w:t>2.4  Cross-Site Scripting - DOM-based</w:t>
       </w:r>
@@ -2740,10 +2772,10 @@
           <w:noProof/>
         </w:rPr>
         <w:drawing>
-          <wp:inline distT="0" distB="0" distL="0" distR="0" wp14:anchorId="14F90073" wp14:editId="7EA048BD">
+          <wp:inline distT="0" distB="0" distL="0" distR="0" wp14:anchorId="604F93AA" wp14:editId="6675DE7E">
             <wp:extent cx="5715000" cy="3571717"/>
             <wp:effectExtent l="19050" t="19050" r="19050" b="10160"/>
-            <wp:docPr id="1777288348" name="Picture 7"/>
+            <wp:docPr id="697015066" name="Picture 7"/>
             <wp:cNvGraphicFramePr>
               <a:graphicFrameLocks xmlns:a="http://schemas.openxmlformats.org/drawingml/2006/main" noChangeAspect="1"/>
             </wp:cNvGraphicFramePr>
@@ -2751,7 +2783,7 @@
               <a:graphicData uri="http://schemas.openxmlformats.org/drawingml/2006/picture">
                 <pic:pic xmlns:pic="http://schemas.openxmlformats.org/drawingml/2006/picture">
                   <pic:nvPicPr>
-                    <pic:cNvPr id="1777288348" name=""/>
+                    <pic:cNvPr id="697015066" name=""/>
                     <pic:cNvPicPr/>
                   </pic:nvPicPr>
                   <pic:blipFill>
@@ -2814,10 +2846,10 @@
           <w:noProof/>
         </w:rPr>
         <w:drawing>
-          <wp:inline distT="0" distB="0" distL="0" distR="0" wp14:anchorId="58D4E36A" wp14:editId="51AD40EB">
+          <wp:inline distT="0" distB="0" distL="0" distR="0" wp14:anchorId="48C00F18" wp14:editId="24D04F10">
             <wp:extent cx="5715000" cy="3571717"/>
             <wp:effectExtent l="19050" t="19050" r="19050" b="10160"/>
-            <wp:docPr id="2001829002" name="Picture 8"/>
+            <wp:docPr id="221611420" name="Picture 8"/>
             <wp:cNvGraphicFramePr>
               <a:graphicFrameLocks xmlns:a="http://schemas.openxmlformats.org/drawingml/2006/main" noChangeAspect="1"/>
             </wp:cNvGraphicFramePr>
@@ -2825,7 +2857,7 @@
               <a:graphicData uri="http://schemas.openxmlformats.org/drawingml/2006/picture">
                 <pic:pic xmlns:pic="http://schemas.openxmlformats.org/drawingml/2006/picture">
                   <pic:nvPicPr>
-                    <pic:cNvPr id="2001829002" name=""/>
+                    <pic:cNvPr id="221611420" name=""/>
                     <pic:cNvPicPr/>
                   </pic:nvPicPr>
                   <pic:blipFill>
@@ -2877,7 +2909,7 @@
       <w:pPr>
         <w:pStyle w:val="Heading2"/>
       </w:pPr>
-      <w:bookmarkStart w:id="13" w:name="_Toc242295524"/>
+      <w:bookmarkStart w:id="13" w:name="_Toc242551129"/>
       <w:r>
         <w:t>2.5  Cross-Site Request Forgery (CSRF)</w:t>
       </w:r>
@@ -2903,10 +2935,10 @@
         </w:rPr>
         <w:lastRenderedPageBreak/>
         <w:drawing>
-          <wp:inline distT="0" distB="0" distL="0" distR="0" wp14:anchorId="210070A3" wp14:editId="486B2668">
+          <wp:inline distT="0" distB="0" distL="0" distR="0" wp14:anchorId="01435D68" wp14:editId="1C23CF31">
             <wp:extent cx="5715000" cy="3571717"/>
             <wp:effectExtent l="19050" t="19050" r="19050" b="10160"/>
-            <wp:docPr id="1253894719" name="Picture 9"/>
+            <wp:docPr id="1174479986" name="Picture 9"/>
             <wp:cNvGraphicFramePr>
               <a:graphicFrameLocks xmlns:a="http://schemas.openxmlformats.org/drawingml/2006/main" noChangeAspect="1"/>
             </wp:cNvGraphicFramePr>
@@ -2914,7 +2946,7 @@
               <a:graphicData uri="http://schemas.openxmlformats.org/drawingml/2006/picture">
                 <pic:pic xmlns:pic="http://schemas.openxmlformats.org/drawingml/2006/picture">
                   <pic:nvPicPr>
-                    <pic:cNvPr id="1253894719" name=""/>
+                    <pic:cNvPr id="1174479986" name=""/>
                     <pic:cNvPicPr/>
                   </pic:nvPicPr>
                   <pic:blipFill>
@@ -2971,10 +3003,10 @@
           <w:noProof/>
         </w:rPr>
         <w:drawing>
-          <wp:inline distT="0" distB="0" distL="0" distR="0" wp14:anchorId="0EB23333" wp14:editId="25DA7299">
+          <wp:inline distT="0" distB="0" distL="0" distR="0" wp14:anchorId="432578DC" wp14:editId="75641919">
             <wp:extent cx="5715000" cy="3571717"/>
             <wp:effectExtent l="19050" t="19050" r="19050" b="10160"/>
-            <wp:docPr id="1677481898" name="Picture 10"/>
+            <wp:docPr id="1874653150" name="Picture 10"/>
             <wp:cNvGraphicFramePr>
               <a:graphicFrameLocks xmlns:a="http://schemas.openxmlformats.org/drawingml/2006/main" noChangeAspect="1"/>
             </wp:cNvGraphicFramePr>
@@ -2982,7 +3014,7 @@
               <a:graphicData uri="http://schemas.openxmlformats.org/drawingml/2006/picture">
                 <pic:pic xmlns:pic="http://schemas.openxmlformats.org/drawingml/2006/picture">
                   <pic:nvPicPr>
-                    <pic:cNvPr id="1677481898" name=""/>
+                    <pic:cNvPr id="1874653150" name=""/>
                     <pic:cNvPicPr/>
                   </pic:nvPicPr>
                   <pic:blipFill>
@@ -3027,7 +3059,7 @@
           <w:i/>
           <w:sz w:val="18"/>
         </w:rPr>
-        <w:t>Figure 2.9 - Vulnerable mode: after visiting the malicious page, $500 has been transferred to NB-1000-ATTACKER with no consent; the balance is now $4730.75.</w:t>
+        <w:t>Figure 2.9 - Vulnerable mode: merely opening the malicious page silently submitted the transfer - the app confirms $500.00 was sent to NB-1000-ATTACKER with no consent (balance before was $5230.75, so it drops to $4730.75).</w:t>
       </w:r>
     </w:p>
     <w:p>
@@ -3045,10 +3077,10 @@
         </w:rPr>
         <w:lastRenderedPageBreak/>
         <w:drawing>
-          <wp:inline distT="0" distB="0" distL="0" distR="0" wp14:anchorId="4B518424" wp14:editId="43EAE831">
+          <wp:inline distT="0" distB="0" distL="0" distR="0" wp14:anchorId="5E2EC815" wp14:editId="3BB6F865">
             <wp:extent cx="5715000" cy="3571717"/>
             <wp:effectExtent l="19050" t="19050" r="19050" b="10160"/>
-            <wp:docPr id="2133916856" name="Picture 11"/>
+            <wp:docPr id="899263854" name="Picture 11"/>
             <wp:cNvGraphicFramePr>
               <a:graphicFrameLocks xmlns:a="http://schemas.openxmlformats.org/drawingml/2006/main" noChangeAspect="1"/>
             </wp:cNvGraphicFramePr>
@@ -3056,7 +3088,7 @@
               <a:graphicData uri="http://schemas.openxmlformats.org/drawingml/2006/picture">
                 <pic:pic xmlns:pic="http://schemas.openxmlformats.org/drawingml/2006/picture">
                   <pic:nvPicPr>
-                    <pic:cNvPr id="2133916856" name=""/>
+                    <pic:cNvPr id="899263854" name=""/>
                     <pic:cNvPicPr/>
                   </pic:nvPicPr>
                   <pic:blipFill>
@@ -3108,7 +3140,7 @@
       <w:pPr>
         <w:pStyle w:val="Heading2"/>
       </w:pPr>
-      <w:bookmarkStart w:id="14" w:name="_Toc242295525"/>
+      <w:bookmarkStart w:id="14" w:name="_Toc242551130"/>
       <w:r>
         <w:t>2.6  SQL Injection - Easy (authentication bypass)</w:t>
       </w:r>
@@ -3132,14 +3164,6 @@
           <w:rFonts w:ascii="Consolas" w:hAnsi="Consolas"/>
           <w:sz w:val="18"/>
         </w:rPr>
-        <w:t>// [VULNERABLE]</w:t>
-      </w:r>
-      <w:r>
-        <w:rPr>
-          <w:rFonts w:ascii="Consolas" w:hAnsi="Consolas"/>
-          <w:sz w:val="18"/>
-        </w:rPr>
-        <w:br/>
         <w:t>const sql = "SELECT * FROM users WHERE username = '" + username +</w:t>
       </w:r>
       <w:r>
@@ -3171,10 +3195,10 @@
         </w:rPr>
         <w:lastRenderedPageBreak/>
         <w:drawing>
-          <wp:inline distT="0" distB="0" distL="0" distR="0" wp14:anchorId="02F7BC49" wp14:editId="29768C23">
+          <wp:inline distT="0" distB="0" distL="0" distR="0" wp14:anchorId="4F1F6213" wp14:editId="5DD7D298">
             <wp:extent cx="5715000" cy="3571717"/>
             <wp:effectExtent l="19050" t="19050" r="19050" b="10160"/>
-            <wp:docPr id="1317342534" name="Picture 12"/>
+            <wp:docPr id="75316268" name="Picture 12"/>
             <wp:cNvGraphicFramePr>
               <a:graphicFrameLocks xmlns:a="http://schemas.openxmlformats.org/drawingml/2006/main" noChangeAspect="1"/>
             </wp:cNvGraphicFramePr>
@@ -3182,7 +3206,7 @@
               <a:graphicData uri="http://schemas.openxmlformats.org/drawingml/2006/picture">
                 <pic:pic xmlns:pic="http://schemas.openxmlformats.org/drawingml/2006/picture">
                   <pic:nvPicPr>
-                    <pic:cNvPr id="1317342534" name=""/>
+                    <pic:cNvPr id="75316268" name=""/>
                     <pic:cNvPicPr/>
                   </pic:nvPicPr>
                   <pic:blipFill>
@@ -3239,10 +3263,10 @@
           <w:noProof/>
         </w:rPr>
         <w:drawing>
-          <wp:inline distT="0" distB="0" distL="0" distR="0" wp14:anchorId="74837BF9" wp14:editId="31B28A76">
+          <wp:inline distT="0" distB="0" distL="0" distR="0" wp14:anchorId="5F09116A" wp14:editId="45A4C9A0">
             <wp:extent cx="5715000" cy="3571717"/>
             <wp:effectExtent l="19050" t="19050" r="19050" b="10160"/>
-            <wp:docPr id="1464248964" name="Picture 13"/>
+            <wp:docPr id="1532364034" name="Picture 13"/>
             <wp:cNvGraphicFramePr>
               <a:graphicFrameLocks xmlns:a="http://schemas.openxmlformats.org/drawingml/2006/main" noChangeAspect="1"/>
             </wp:cNvGraphicFramePr>
@@ -3250,7 +3274,7 @@
               <a:graphicData uri="http://schemas.openxmlformats.org/drawingml/2006/picture">
                 <pic:pic xmlns:pic="http://schemas.openxmlformats.org/drawingml/2006/picture">
                   <pic:nvPicPr>
-                    <pic:cNvPr id="1464248964" name=""/>
+                    <pic:cNvPr id="1532364034" name=""/>
                     <pic:cNvPicPr/>
                   </pic:nvPicPr>
                   <pic:blipFill>
@@ -3316,14 +3340,6 @@
           <w:rFonts w:ascii="Consolas" w:hAnsi="Consolas"/>
           <w:sz w:val="18"/>
         </w:rPr>
-        <w:t>// [SAFE]</w:t>
-      </w:r>
-      <w:r>
-        <w:rPr>
-          <w:rFonts w:ascii="Consolas" w:hAnsi="Consolas"/>
-          <w:sz w:val="18"/>
-        </w:rPr>
-        <w:br/>
         <w:t>if (!/^[A-Za-z0-9_.\-]{1,32}$/.test(username)) return reject();</w:t>
       </w:r>
       <w:r>
@@ -3357,10 +3373,10 @@
         </w:rPr>
         <w:lastRenderedPageBreak/>
         <w:drawing>
-          <wp:inline distT="0" distB="0" distL="0" distR="0" wp14:anchorId="3D77DF34" wp14:editId="6CCDE40C">
+          <wp:inline distT="0" distB="0" distL="0" distR="0" wp14:anchorId="79C724DC" wp14:editId="240096C5">
             <wp:extent cx="5715000" cy="3571717"/>
             <wp:effectExtent l="19050" t="19050" r="19050" b="10160"/>
-            <wp:docPr id="253834994" name="Picture 14"/>
+            <wp:docPr id="207170836" name="Picture 14"/>
             <wp:cNvGraphicFramePr>
               <a:graphicFrameLocks xmlns:a="http://schemas.openxmlformats.org/drawingml/2006/main" noChangeAspect="1"/>
             </wp:cNvGraphicFramePr>
@@ -3368,7 +3384,7 @@
               <a:graphicData uri="http://schemas.openxmlformats.org/drawingml/2006/picture">
                 <pic:pic xmlns:pic="http://schemas.openxmlformats.org/drawingml/2006/picture">
                   <pic:nvPicPr>
-                    <pic:cNvPr id="253834994" name=""/>
+                    <pic:cNvPr id="207170836" name=""/>
                     <pic:cNvPicPr/>
                   </pic:nvPicPr>
                   <pic:blipFill>
@@ -3424,7 +3440,7 @@
       <w:pPr>
         <w:pStyle w:val="Heading2"/>
       </w:pPr>
-      <w:bookmarkStart w:id="15" w:name="_Toc242295526"/>
+      <w:bookmarkStart w:id="15" w:name="_Toc242551131"/>
       <w:r>
         <w:t>2.7  SQL Injection - Intermediate (blind, boolean-based)</w:t>
       </w:r>
@@ -3455,10 +3471,10 @@
         </w:rPr>
         <w:lastRenderedPageBreak/>
         <w:drawing>
-          <wp:inline distT="0" distB="0" distL="0" distR="0" wp14:anchorId="16EB38F0" wp14:editId="528C560C">
+          <wp:inline distT="0" distB="0" distL="0" distR="0" wp14:anchorId="32A637B7" wp14:editId="68266514">
             <wp:extent cx="5715000" cy="3571717"/>
             <wp:effectExtent l="19050" t="19050" r="19050" b="10160"/>
-            <wp:docPr id="673172812" name="Picture 15"/>
+            <wp:docPr id="2126243132" name="Picture 15"/>
             <wp:cNvGraphicFramePr>
               <a:graphicFrameLocks xmlns:a="http://schemas.openxmlformats.org/drawingml/2006/main" noChangeAspect="1"/>
             </wp:cNvGraphicFramePr>
@@ -3466,7 +3482,7 @@
               <a:graphicData uri="http://schemas.openxmlformats.org/drawingml/2006/picture">
                 <pic:pic xmlns:pic="http://schemas.openxmlformats.org/drawingml/2006/picture">
                   <pic:nvPicPr>
-                    <pic:cNvPr id="673172812" name=""/>
+                    <pic:cNvPr id="2126243132" name=""/>
                     <pic:cNvPicPr/>
                   </pic:nvPicPr>
                   <pic:blipFill>
@@ -3523,10 +3539,10 @@
           <w:noProof/>
         </w:rPr>
         <w:drawing>
-          <wp:inline distT="0" distB="0" distL="0" distR="0" wp14:anchorId="6F3F4EEE" wp14:editId="3758539C">
+          <wp:inline distT="0" distB="0" distL="0" distR="0" wp14:anchorId="0E49B760" wp14:editId="2DCE8DE5">
             <wp:extent cx="5715000" cy="3571717"/>
             <wp:effectExtent l="19050" t="19050" r="19050" b="10160"/>
-            <wp:docPr id="1302344669" name="Picture 16"/>
+            <wp:docPr id="1314854646" name="Picture 16"/>
             <wp:cNvGraphicFramePr>
               <a:graphicFrameLocks xmlns:a="http://schemas.openxmlformats.org/drawingml/2006/main" noChangeAspect="1"/>
             </wp:cNvGraphicFramePr>
@@ -3534,7 +3550,7 @@
               <a:graphicData uri="http://schemas.openxmlformats.org/drawingml/2006/picture">
                 <pic:pic xmlns:pic="http://schemas.openxmlformats.org/drawingml/2006/picture">
                   <pic:nvPicPr>
-                    <pic:cNvPr id="1302344669" name=""/>
+                    <pic:cNvPr id="1314854646" name=""/>
                     <pic:cNvPicPr/>
                   </pic:nvPicPr>
                   <pic:blipFill>
@@ -3597,10 +3613,10 @@
         </w:rPr>
         <w:lastRenderedPageBreak/>
         <w:drawing>
-          <wp:inline distT="0" distB="0" distL="0" distR="0" wp14:anchorId="7E1A3DFE" wp14:editId="164A3177">
+          <wp:inline distT="0" distB="0" distL="0" distR="0" wp14:anchorId="0AEE14A6" wp14:editId="5B462A38">
             <wp:extent cx="5715000" cy="3571717"/>
             <wp:effectExtent l="19050" t="19050" r="19050" b="10160"/>
-            <wp:docPr id="1738729427" name="Picture 17"/>
+            <wp:docPr id="501455572" name="Picture 17"/>
             <wp:cNvGraphicFramePr>
               <a:graphicFrameLocks xmlns:a="http://schemas.openxmlformats.org/drawingml/2006/main" noChangeAspect="1"/>
             </wp:cNvGraphicFramePr>
@@ -3608,7 +3624,7 @@
               <a:graphicData uri="http://schemas.openxmlformats.org/drawingml/2006/picture">
                 <pic:pic xmlns:pic="http://schemas.openxmlformats.org/drawingml/2006/picture">
                   <pic:nvPicPr>
-                    <pic:cNvPr id="1738729427" name=""/>
+                    <pic:cNvPr id="501455572" name=""/>
                     <pic:cNvPicPr/>
                   </pic:nvPicPr>
                   <pic:blipFill>
@@ -3660,7 +3676,7 @@
       <w:pPr>
         <w:pStyle w:val="Heading2"/>
       </w:pPr>
-      <w:bookmarkStart w:id="16" w:name="_Toc242295527"/>
+      <w:bookmarkStart w:id="16" w:name="_Toc242551132"/>
       <w:r>
         <w:t>2.8  SQL Injection - Advanced (UNION-based extraction)</w:t>
       </w:r>
@@ -3705,10 +3721,10 @@
           <w:noProof/>
         </w:rPr>
         <w:drawing>
-          <wp:inline distT="0" distB="0" distL="0" distR="0" wp14:anchorId="45E754D8" wp14:editId="165D59C9">
+          <wp:inline distT="0" distB="0" distL="0" distR="0" wp14:anchorId="5AFA7938" wp14:editId="25557A6B">
             <wp:extent cx="5715000" cy="3571717"/>
             <wp:effectExtent l="19050" t="19050" r="19050" b="10160"/>
-            <wp:docPr id="336896595" name="Picture 18"/>
+            <wp:docPr id="1570170225" name="Picture 18"/>
             <wp:cNvGraphicFramePr>
               <a:graphicFrameLocks xmlns:a="http://schemas.openxmlformats.org/drawingml/2006/main" noChangeAspect="1"/>
             </wp:cNvGraphicFramePr>
@@ -3716,7 +3732,7 @@
               <a:graphicData uri="http://schemas.openxmlformats.org/drawingml/2006/picture">
                 <pic:pic xmlns:pic="http://schemas.openxmlformats.org/drawingml/2006/picture">
                   <pic:nvPicPr>
-                    <pic:cNvPr id="336896595" name=""/>
+                    <pic:cNvPr id="1570170225" name=""/>
                     <pic:cNvPicPr/>
                   </pic:nvPicPr>
                   <pic:blipFill>
@@ -3803,10 +3819,10 @@
           <w:noProof/>
         </w:rPr>
         <w:drawing>
-          <wp:inline distT="0" distB="0" distL="0" distR="0" wp14:anchorId="3B44560F" wp14:editId="55F4408E">
+          <wp:inline distT="0" distB="0" distL="0" distR="0" wp14:anchorId="463A51E2" wp14:editId="662144B3">
             <wp:extent cx="5715000" cy="3571717"/>
             <wp:effectExtent l="19050" t="19050" r="19050" b="10160"/>
-            <wp:docPr id="1350352631" name="Picture 19"/>
+            <wp:docPr id="577335846" name="Picture 19"/>
             <wp:cNvGraphicFramePr>
               <a:graphicFrameLocks xmlns:a="http://schemas.openxmlformats.org/drawingml/2006/main" noChangeAspect="1"/>
             </wp:cNvGraphicFramePr>
@@ -3814,7 +3830,7 @@
               <a:graphicData uri="http://schemas.openxmlformats.org/drawingml/2006/picture">
                 <pic:pic xmlns:pic="http://schemas.openxmlformats.org/drawingml/2006/picture">
                   <pic:nvPicPr>
-                    <pic:cNvPr id="1350352631" name=""/>
+                    <pic:cNvPr id="577335846" name=""/>
                     <pic:cNvPicPr/>
                   </pic:nvPicPr>
                   <pic:blipFill>
@@ -3880,10 +3896,10 @@
           <w:noProof/>
         </w:rPr>
         <w:drawing>
-          <wp:inline distT="0" distB="0" distL="0" distR="0" wp14:anchorId="12C4E2DC" wp14:editId="351DDEAC">
+          <wp:inline distT="0" distB="0" distL="0" distR="0" wp14:anchorId="27DF5A8A" wp14:editId="09DFB4A1">
             <wp:extent cx="5715000" cy="3571717"/>
             <wp:effectExtent l="19050" t="19050" r="19050" b="10160"/>
-            <wp:docPr id="1372147563" name="Picture 20"/>
+            <wp:docPr id="1397433968" name="Picture 20"/>
             <wp:cNvGraphicFramePr>
               <a:graphicFrameLocks xmlns:a="http://schemas.openxmlformats.org/drawingml/2006/main" noChangeAspect="1"/>
             </wp:cNvGraphicFramePr>
@@ -3891,7 +3907,7 @@
               <a:graphicData uri="http://schemas.openxmlformats.org/drawingml/2006/picture">
                 <pic:pic xmlns:pic="http://schemas.openxmlformats.org/drawingml/2006/picture">
                   <pic:nvPicPr>
-                    <pic:cNvPr id="1372147563" name=""/>
+                    <pic:cNvPr id="1397433968" name=""/>
                     <pic:cNvPicPr/>
                   </pic:nvPicPr>
                   <pic:blipFill>
@@ -3943,7 +3959,7 @@
       <w:pPr>
         <w:pStyle w:val="Heading2"/>
       </w:pPr>
-      <w:bookmarkStart w:id="17" w:name="_Toc242295528"/>
+      <w:bookmarkStart w:id="17" w:name="_Toc242551133"/>
       <w:r>
         <w:lastRenderedPageBreak/>
         <w:t>2.9  Summary of defences</w:t>
@@ -3996,7 +4012,7 @@
       <w:pPr>
         <w:pStyle w:val="Heading1"/>
       </w:pPr>
-      <w:bookmarkStart w:id="18" w:name="_Toc242295529"/>
+      <w:bookmarkStart w:id="18" w:name="_Toc242551134"/>
       <w:r>
         <w:lastRenderedPageBreak/>
         <w:t>Part 3 - Red Team Engagement</w:t>
@@ -4007,7 +4023,7 @@
       <w:pPr>
         <w:pStyle w:val="Heading2"/>
       </w:pPr>
-      <w:bookmarkStart w:id="19" w:name="_Toc242295530"/>
+      <w:bookmarkStart w:id="19" w:name="_Toc242551135"/>
       <w:r>
         <w:t>3.1  Scope and rules of engagement</w:t>
       </w:r>
@@ -4022,7 +4038,7 @@
       <w:pPr>
         <w:pStyle w:val="Heading2"/>
       </w:pPr>
-      <w:bookmarkStart w:id="20" w:name="_Toc242295531"/>
+      <w:bookmarkStart w:id="20" w:name="_Toc242551136"/>
       <w:r>
         <w:t>3.2  Reconnaissance</w:t>
       </w:r>
@@ -4053,7 +4069,7 @@
       <w:pPr>
         <w:pStyle w:val="Heading2"/>
       </w:pPr>
-      <w:bookmarkStart w:id="21" w:name="_Toc242295532"/>
+      <w:bookmarkStart w:id="21" w:name="_Toc242551137"/>
       <w:r>
         <w:t>3.3  Scanning and enumeration</w:t>
       </w:r>
@@ -4132,7 +4148,7 @@
       <w:pPr>
         <w:pStyle w:val="Heading2"/>
       </w:pPr>
-      <w:bookmarkStart w:id="22" w:name="_Toc242295533"/>
+      <w:bookmarkStart w:id="22" w:name="_Toc242551138"/>
       <w:r>
         <w:t>3.4  Exploitation (initial access)</w:t>
       </w:r>
@@ -4176,7 +4192,7 @@
       <w:pPr>
         <w:pStyle w:val="Heading2"/>
       </w:pPr>
-      <w:bookmarkStart w:id="23" w:name="_Toc242295534"/>
+      <w:bookmarkStart w:id="23" w:name="_Toc242551139"/>
       <w:r>
         <w:t>3.5  Privilege escalation</w:t>
       </w:r>
@@ -4263,7 +4279,7 @@
       <w:pPr>
         <w:pStyle w:val="Heading2"/>
       </w:pPr>
-      <w:bookmarkStart w:id="24" w:name="_Toc242295535"/>
+      <w:bookmarkStart w:id="24" w:name="_Toc242551140"/>
       <w:r>
         <w:lastRenderedPageBreak/>
         <w:t>3.6  Post-exploitation</w:t>
@@ -4303,7 +4319,7 @@
       <w:pPr>
         <w:pStyle w:val="Heading2"/>
       </w:pPr>
-      <w:bookmarkStart w:id="25" w:name="_Toc242295536"/>
+      <w:bookmarkStart w:id="25" w:name="_Toc242551141"/>
       <w:r>
         <w:t>3.7  Reporting and remediation</w:t>
       </w:r>
@@ -4526,7 +4542,7 @@
   <w:abstractNum w:abstractNumId="0" w15:restartNumberingAfterBreak="0">
     <w:nsid w:val="FFFFFF89"/>
     <w:multiLevelType w:val="singleLevel"/>
-    <w:tmpl w:val="FB50D2E0"/>
+    <w:tmpl w:val="10723A70"/>
     <w:lvl w:ilvl="0">
       <w:start w:val="1"/>
       <w:numFmt w:val="bullet"/>
@@ -4544,7 +4560,7 @@
       </w:rPr>
     </w:lvl>
   </w:abstractNum>
-  <w:num w:numId="1" w16cid:durableId="687486054">
+  <w:num w:numId="1" w16cid:durableId="1343968278">
     <w:abstractNumId w:val="0"/>
   </w:num>
 </w:numbering>
@@ -4965,7 +4981,7 @@
     <w:link w:val="Heading1Char"/>
     <w:uiPriority w:val="9"/>
     <w:qFormat/>
-    <w:rsid w:val="00483AA7"/>
+    <w:rsid w:val="00A65037"/>
     <w:pPr>
       <w:keepNext/>
       <w:keepLines/>
@@ -4987,7 +5003,7 @@
     <w:uiPriority w:val="9"/>
     <w:unhideWhenUsed/>
     <w:qFormat/>
-    <w:rsid w:val="00483AA7"/>
+    <w:rsid w:val="00A65037"/>
     <w:pPr>
       <w:keepNext/>
       <w:keepLines/>
@@ -5010,7 +5026,7 @@
     <w:semiHidden/>
     <w:unhideWhenUsed/>
     <w:qFormat/>
-    <w:rsid w:val="00483AA7"/>
+    <w:rsid w:val="00A65037"/>
     <w:pPr>
       <w:keepNext/>
       <w:keepLines/>
@@ -5033,7 +5049,7 @@
     <w:semiHidden/>
     <w:unhideWhenUsed/>
     <w:qFormat/>
-    <w:rsid w:val="00483AA7"/>
+    <w:rsid w:val="00A65037"/>
     <w:pPr>
       <w:keepNext/>
       <w:keepLines/>
@@ -5056,7 +5072,7 @@
     <w:semiHidden/>
     <w:unhideWhenUsed/>
     <w:qFormat/>
-    <w:rsid w:val="00483AA7"/>
+    <w:rsid w:val="00A65037"/>
     <w:pPr>
       <w:keepNext/>
       <w:keepLines/>
@@ -5077,7 +5093,7 @@
     <w:semiHidden/>
     <w:unhideWhenUsed/>
     <w:qFormat/>
-    <w:rsid w:val="00483AA7"/>
+    <w:rsid w:val="00A65037"/>
     <w:pPr>
       <w:keepNext/>
       <w:keepLines/>
@@ -5100,7 +5116,7 @@
     <w:semiHidden/>
     <w:unhideWhenUsed/>
     <w:qFormat/>
-    <w:rsid w:val="00483AA7"/>
+    <w:rsid w:val="00A65037"/>
     <w:pPr>
       <w:keepNext/>
       <w:keepLines/>
@@ -5121,7 +5137,7 @@
     <w:semiHidden/>
     <w:unhideWhenUsed/>
     <w:qFormat/>
-    <w:rsid w:val="00483AA7"/>
+    <w:rsid w:val="00A65037"/>
     <w:pPr>
       <w:keepNext/>
       <w:keepLines/>
@@ -5144,7 +5160,7 @@
     <w:semiHidden/>
     <w:unhideWhenUsed/>
     <w:qFormat/>
-    <w:rsid w:val="00483AA7"/>
+    <w:rsid w:val="00A65037"/>
     <w:pPr>
       <w:keepNext/>
       <w:keepLines/>
@@ -5188,7 +5204,7 @@
     <w:basedOn w:val="DefaultParagraphFont"/>
     <w:link w:val="Heading1"/>
     <w:uiPriority w:val="9"/>
-    <w:rsid w:val="00483AA7"/>
+    <w:rsid w:val="00A65037"/>
     <w:rPr>
       <w:rFonts w:asciiTheme="majorHAnsi" w:eastAsiaTheme="majorEastAsia" w:hAnsiTheme="majorHAnsi" w:cstheme="majorBidi"/>
       <w:color w:val="0F4761" w:themeColor="accent1" w:themeShade="BF"/>
@@ -5201,7 +5217,7 @@
     <w:basedOn w:val="DefaultParagraphFont"/>
     <w:link w:val="Heading2"/>
     <w:uiPriority w:val="9"/>
-    <w:rsid w:val="00483AA7"/>
+    <w:rsid w:val="00A65037"/>
     <w:rPr>
       <w:rFonts w:asciiTheme="majorHAnsi" w:eastAsiaTheme="majorEastAsia" w:hAnsiTheme="majorHAnsi" w:cstheme="majorBidi"/>
       <w:color w:val="0F4761" w:themeColor="accent1" w:themeShade="BF"/>
@@ -5215,7 +5231,7 @@
     <w:link w:val="Heading3"/>
     <w:uiPriority w:val="9"/>
     <w:semiHidden/>
-    <w:rsid w:val="00483AA7"/>
+    <w:rsid w:val="00A65037"/>
     <w:rPr>
       <w:rFonts w:eastAsiaTheme="majorEastAsia" w:cstheme="majorBidi"/>
       <w:color w:val="0F4761" w:themeColor="accent1" w:themeShade="BF"/>
@@ -5229,7 +5245,7 @@
     <w:link w:val="Heading4"/>
     <w:uiPriority w:val="9"/>
     <w:semiHidden/>
-    <w:rsid w:val="00483AA7"/>
+    <w:rsid w:val="00A65037"/>
     <w:rPr>
       <w:rFonts w:eastAsiaTheme="majorEastAsia" w:cstheme="majorBidi"/>
       <w:i/>
@@ -5243,7 +5259,7 @@
     <w:link w:val="Heading5"/>
     <w:uiPriority w:val="9"/>
     <w:semiHidden/>
-    <w:rsid w:val="00483AA7"/>
+    <w:rsid w:val="00A65037"/>
     <w:rPr>
       <w:rFonts w:eastAsiaTheme="majorEastAsia" w:cstheme="majorBidi"/>
       <w:color w:val="0F4761" w:themeColor="accent1" w:themeShade="BF"/>
@@ -5255,7 +5271,7 @@
     <w:link w:val="Heading6"/>
     <w:uiPriority w:val="9"/>
     <w:semiHidden/>
-    <w:rsid w:val="00483AA7"/>
+    <w:rsid w:val="00A65037"/>
     <w:rPr>
       <w:rFonts w:eastAsiaTheme="majorEastAsia" w:cstheme="majorBidi"/>
       <w:i/>
@@ -5269,7 +5285,7 @@
     <w:link w:val="Heading7"/>
     <w:uiPriority w:val="9"/>
     <w:semiHidden/>
-    <w:rsid w:val="00483AA7"/>
+    <w:rsid w:val="00A65037"/>
     <w:rPr>
       <w:rFonts w:eastAsiaTheme="majorEastAsia" w:cstheme="majorBidi"/>
       <w:color w:val="595959" w:themeColor="text1" w:themeTint="A6"/>
@@ -5281,7 +5297,7 @@
     <w:link w:val="Heading8"/>
     <w:uiPriority w:val="9"/>
     <w:semiHidden/>
-    <w:rsid w:val="00483AA7"/>
+    <w:rsid w:val="00A65037"/>
     <w:rPr>
       <w:rFonts w:eastAsiaTheme="majorEastAsia" w:cstheme="majorBidi"/>
       <w:i/>
@@ -5295,7 +5311,7 @@
     <w:link w:val="Heading9"/>
     <w:uiPriority w:val="9"/>
     <w:semiHidden/>
-    <w:rsid w:val="00483AA7"/>
+    <w:rsid w:val="00A65037"/>
     <w:rPr>
       <w:rFonts w:eastAsiaTheme="majorEastAsia" w:cstheme="majorBidi"/>
       <w:color w:val="272727" w:themeColor="text1" w:themeTint="D8"/>
@@ -5308,7 +5324,7 @@
     <w:link w:val="TitleChar"/>
     <w:uiPriority w:val="10"/>
     <w:qFormat/>
-    <w:rsid w:val="00483AA7"/>
+    <w:rsid w:val="00A65037"/>
     <w:pPr>
       <w:spacing w:after="80"/>
       <w:contextualSpacing/>
@@ -5326,7 +5342,7 @@
     <w:basedOn w:val="DefaultParagraphFont"/>
     <w:link w:val="Title"/>
     <w:uiPriority w:val="10"/>
-    <w:rsid w:val="00483AA7"/>
+    <w:rsid w:val="00A65037"/>
     <w:rPr>
       <w:rFonts w:asciiTheme="majorHAnsi" w:eastAsiaTheme="majorEastAsia" w:hAnsiTheme="majorHAnsi" w:cstheme="majorBidi"/>
       <w:spacing w:val="-10"/>
@@ -5342,7 +5358,7 @@
     <w:link w:val="SubtitleChar"/>
     <w:uiPriority w:val="11"/>
     <w:qFormat/>
-    <w:rsid w:val="00483AA7"/>
+    <w:rsid w:val="00A65037"/>
     <w:pPr>
       <w:numPr>
         <w:ilvl w:val="1"/>
@@ -5361,7 +5377,7 @@
     <w:basedOn w:val="DefaultParagraphFont"/>
     <w:link w:val="Subtitle"/>
     <w:uiPriority w:val="11"/>
-    <w:rsid w:val="00483AA7"/>
+    <w:rsid w:val="00A65037"/>
     <w:rPr>
       <w:rFonts w:eastAsiaTheme="majorEastAsia" w:cstheme="majorBidi"/>
       <w:color w:val="595959" w:themeColor="text1" w:themeTint="A6"/>
@@ -5377,7 +5393,7 @@
     <w:link w:val="QuoteChar"/>
     <w:uiPriority w:val="29"/>
     <w:qFormat/>
-    <w:rsid w:val="00483AA7"/>
+    <w:rsid w:val="00A65037"/>
     <w:pPr>
       <w:spacing w:before="160"/>
       <w:jc w:val="center"/>
@@ -5393,7 +5409,7 @@
     <w:basedOn w:val="DefaultParagraphFont"/>
     <w:link w:val="Quote"/>
     <w:uiPriority w:val="29"/>
-    <w:rsid w:val="00483AA7"/>
+    <w:rsid w:val="00A65037"/>
     <w:rPr>
       <w:i/>
       <w:iCs/>
@@ -5405,7 +5421,7 @@
     <w:basedOn w:val="Normal"/>
     <w:uiPriority w:val="34"/>
     <w:qFormat/>
-    <w:rsid w:val="00483AA7"/>
+    <w:rsid w:val="00A65037"/>
     <w:pPr>
       <w:ind w:left="720"/>
       <w:contextualSpacing/>
@@ -5416,7 +5432,7 @@
     <w:basedOn w:val="DefaultParagraphFont"/>
     <w:uiPriority w:val="21"/>
     <w:qFormat/>
-    <w:rsid w:val="00483AA7"/>
+    <w:rsid w:val="00A65037"/>
     <w:rPr>
       <w:i/>
       <w:iCs/>
@@ -5430,7 +5446,7 @@
     <w:link w:val="IntenseQuoteChar"/>
     <w:uiPriority w:val="30"/>
     <w:qFormat/>
-    <w:rsid w:val="00483AA7"/>
+    <w:rsid w:val="00A65037"/>
     <w:pPr>
       <w:pBdr>
         <w:top w:val="single" w:sz="4" w:space="10" w:color="0F4761" w:themeColor="accent1" w:themeShade="BF"/>
@@ -5451,7 +5467,7 @@
     <w:basedOn w:val="DefaultParagraphFont"/>
     <w:link w:val="IntenseQuote"/>
     <w:uiPriority w:val="30"/>
-    <w:rsid w:val="00483AA7"/>
+    <w:rsid w:val="00A65037"/>
     <w:rPr>
       <w:i/>
       <w:iCs/>
@@ -5463,7 +5479,7 @@
     <w:basedOn w:val="DefaultParagraphFont"/>
     <w:uiPriority w:val="32"/>
     <w:qFormat/>
-    <w:rsid w:val="00483AA7"/>
+    <w:rsid w:val="00A65037"/>
     <w:rPr>
       <w:b/>
       <w:bCs/>
@@ -5477,7 +5493,7 @@
     <w:basedOn w:val="Normal"/>
     <w:uiPriority w:val="99"/>
     <w:unhideWhenUsed/>
-    <w:rsid w:val="00483AA7"/>
+    <w:rsid w:val="00A65037"/>
     <w:pPr>
       <w:numPr>
         <w:numId w:val="1"/>
@@ -5491,7 +5507,7 @@
     <w:link w:val="HeaderChar"/>
     <w:uiPriority w:val="99"/>
     <w:unhideWhenUsed/>
-    <w:rsid w:val="00483AA7"/>
+    <w:rsid w:val="00A65037"/>
     <w:pPr>
       <w:tabs>
         <w:tab w:val="center" w:pos="4513"/>
@@ -5505,7 +5521,7 @@
     <w:basedOn w:val="DefaultParagraphFont"/>
     <w:link w:val="Header"/>
     <w:uiPriority w:val="99"/>
-    <w:rsid w:val="00483AA7"/>
+    <w:rsid w:val="00A65037"/>
     <w:rPr>
       <w:rFonts w:ascii="Calibri" w:hAnsi="Calibri"/>
       <w:sz w:val="22"/>
@@ -5517,7 +5533,7 @@
     <w:link w:val="FooterChar"/>
     <w:uiPriority w:val="99"/>
     <w:unhideWhenUsed/>
-    <w:rsid w:val="00483AA7"/>
+    <w:rsid w:val="00A65037"/>
     <w:pPr>
       <w:tabs>
         <w:tab w:val="center" w:pos="4513"/>
@@ -5531,7 +5547,7 @@
     <w:basedOn w:val="DefaultParagraphFont"/>
     <w:link w:val="Footer"/>
     <w:uiPriority w:val="99"/>
-    <w:rsid w:val="00483AA7"/>
+    <w:rsid w:val="00A65037"/>
     <w:rPr>
       <w:rFonts w:ascii="Calibri" w:hAnsi="Calibri"/>
       <w:sz w:val="22"/>
@@ -5543,7 +5559,7 @@
     <w:uiPriority w:val="99"/>
     <w:semiHidden/>
     <w:unhideWhenUsed/>
-    <w:rsid w:val="00483AA7"/>
+    <w:rsid w:val="00A65037"/>
   </w:style>
   <w:style w:type="paragraph" w:styleId="TOC1">
     <w:name w:val="toc 1"/>
@@ -5552,7 +5568,7 @@
     <w:autoRedefine/>
     <w:uiPriority w:val="39"/>
     <w:unhideWhenUsed/>
-    <w:rsid w:val="00483AA7"/>
+    <w:rsid w:val="00A65037"/>
     <w:pPr>
       <w:spacing w:after="100"/>
     </w:pPr>
@@ -5564,7 +5580,7 @@
     <w:autoRedefine/>
     <w:uiPriority w:val="39"/>
     <w:unhideWhenUsed/>
-    <w:rsid w:val="00483AA7"/>
+    <w:rsid w:val="00A65037"/>
     <w:pPr>
       <w:spacing w:after="100"/>
       <w:ind w:left="220"/>

</xml_diff>